<commit_message>
docs(RB): G12 отменена, G11-only Word + пакет RB+GP
Пеламида остаётся в G5. Инструкция пакетной стратегии с групповыми
прогулками для обучения. Анализ 30.08 и keys обновлены.

Co-authored-by: Igor-Lark <Igor-Lark@users.noreply.github.com>
</commit_message>
<xml_diff>
--- a/cursor/Analiz_trafika_RB_Popaj_2026-08-30.docx
+++ b/cursor/Analiz_trafika_RB_Popaj_2026-08-30.docx
@@ -83,7 +83,7 @@
           <w:color w:val="8B1A1A"/>
           <w:sz w:val="22"/>
         </w:rPr>
-        <w:t>G10 забрал 44% показов — основной драйвер; G11 запущен (104 п), **G12 в выгрузке нет**.</w:t>
+        <w:t>G10 забрал 44% показов — основной драйвер; G11 запущен (104 п). **G12 не планируется** — пеламида в G5.</w:t>
       </w:r>
     </w:p>
     <w:p>
@@ -125,7 +125,7 @@
           <w:color w:val="8B1A1A"/>
           <w:sz w:val="22"/>
         </w:rPr>
-        <w:t>G5: схема A **не завершена** — пеламида в заголовках обоих объявлений; G12 не заведена.</w:t>
+        <w:t>G5: пеламида **остаётся** в G5; в G5 добавить минусы −луфарь (чтобы не мешать G11).</w:t>
       </w:r>
     </w:p>
     <w:p>
@@ -1753,7 +1753,7 @@
           <w:color w:val="333333"/>
           <w:sz w:val="22"/>
         </w:rPr>
-        <w:t>G5: пеламида всё ещё в заголовках (…262936 и новое …027646) — по схеме A убрать, завести G12.</w:t>
+        <w:t>G5: пеламида в заголовках — **норма** (G12 отменена). Добавить −луфарь в минусы G5.</w:t>
       </w:r>
     </w:p>
     <w:p>
@@ -3254,7 +3254,7 @@
           <w:color w:val="333333"/>
           <w:sz w:val="22"/>
         </w:rPr>
-        <w:t>☐ G5: убрать пеламиду · завести **G12** по Word схемы A</w:t>
+        <w:t>☐ G5: минусы −луфарь · пеламида **остаётся** (G12 не заводим)</w:t>
       </w:r>
     </w:p>
     <w:p>

</xml_diff>